<commit_message>
Add local food options and polish travel guide exports
</commit_message>
<xml_diff>
--- a/Vietnam_reisboekje_2026.docx
+++ b/Vietnam_reisboekje_2026.docx
@@ -2871,7 +2871,7 @@
       <w:r>
         <w:t xml:space="preserve">Bronnen en prijscontrole: </w:t>
       </w:r>
-      <w:hyperlink r:id="rId10">
+      <w:hyperlink r:id="rId9">
         <w:r>
           <w:rPr>
             <w:color w:val="155D79"/>
@@ -2883,7 +2883,7 @@
       <w:r>
         <w:t xml:space="preserve">  ·  </w:t>
       </w:r>
-      <w:hyperlink r:id="rId11">
+      <w:hyperlink r:id="rId10">
         <w:r>
           <w:rPr>
             <w:color w:val="155D79"/>
@@ -3618,7 +3618,7 @@
       <w:r>
         <w:t xml:space="preserve">Bronnen en prijscontrole: </w:t>
       </w:r>
-      <w:hyperlink r:id="rId12">
+      <w:hyperlink r:id="rId11">
         <w:r>
           <w:rPr>
             <w:color w:val="155D79"/>
@@ -3630,7 +3630,7 @@
       <w:r>
         <w:t xml:space="preserve">  ·  </w:t>
       </w:r>
-      <w:hyperlink r:id="rId13">
+      <w:hyperlink r:id="rId12">
         <w:r>
           <w:rPr>
             <w:color w:val="155D79"/>
@@ -3642,7 +3642,7 @@
       <w:r>
         <w:t xml:space="preserve">  ·  </w:t>
       </w:r>
-      <w:hyperlink r:id="rId14">
+      <w:hyperlink r:id="rId13">
         <w:r>
           <w:rPr>
             <w:color w:val="155D79"/>
@@ -3654,7 +3654,7 @@
       <w:r>
         <w:t xml:space="preserve">  ·  </w:t>
       </w:r>
-      <w:hyperlink r:id="rId15">
+      <w:hyperlink r:id="rId14">
         <w:r>
           <w:rPr>
             <w:color w:val="155D79"/>
@@ -3666,7 +3666,7 @@
       <w:r>
         <w:t xml:space="preserve">  ·  </w:t>
       </w:r>
-      <w:hyperlink r:id="rId16">
+      <w:hyperlink r:id="rId15">
         <w:r>
           <w:rPr>
             <w:color w:val="155D79"/>
@@ -3678,7 +3678,7 @@
       <w:r>
         <w:t xml:space="preserve">  ·  </w:t>
       </w:r>
-      <w:hyperlink r:id="rId17">
+      <w:hyperlink r:id="rId16">
         <w:r>
           <w:rPr>
             <w:color w:val="155D79"/>
@@ -4007,7 +4007,7 @@
       <w:r>
         <w:t xml:space="preserve">Bronnen en prijscontrole: </w:t>
       </w:r>
-      <w:hyperlink r:id="rId12">
+      <w:hyperlink r:id="rId11">
         <w:r>
           <w:rPr>
             <w:color w:val="155D79"/>
@@ -4019,7 +4019,7 @@
       <w:r>
         <w:t xml:space="preserve">  ·  </w:t>
       </w:r>
-      <w:hyperlink r:id="rId18">
+      <w:hyperlink r:id="rId17">
         <w:r>
           <w:rPr>
             <w:color w:val="155D79"/>
@@ -4031,7 +4031,7 @@
       <w:r>
         <w:t xml:space="preserve">  ·  </w:t>
       </w:r>
-      <w:hyperlink r:id="rId19">
+      <w:hyperlink r:id="rId18">
         <w:r>
           <w:rPr>
             <w:color w:val="155D79"/>
@@ -4043,7 +4043,7 @@
       <w:r>
         <w:t xml:space="preserve">  ·  </w:t>
       </w:r>
-      <w:hyperlink r:id="rId20">
+      <w:hyperlink r:id="rId19">
         <w:r>
           <w:rPr>
             <w:color w:val="155D79"/>
@@ -4055,7 +4055,7 @@
       <w:r>
         <w:t xml:space="preserve">  ·  </w:t>
       </w:r>
-      <w:hyperlink r:id="rId21">
+      <w:hyperlink r:id="rId20">
         <w:r>
           <w:rPr>
             <w:color w:val="155D79"/>
@@ -4067,7 +4067,7 @@
       <w:r>
         <w:t xml:space="preserve">  ·  </w:t>
       </w:r>
-      <w:hyperlink r:id="rId22">
+      <w:hyperlink r:id="rId21">
         <w:r>
           <w:rPr>
             <w:color w:val="155D79"/>
@@ -4079,7 +4079,7 @@
       <w:r>
         <w:t xml:space="preserve">  ·  </w:t>
       </w:r>
-      <w:hyperlink r:id="rId23">
+      <w:hyperlink r:id="rId22">
         <w:r>
           <w:rPr>
             <w:color w:val="155D79"/>
@@ -4091,7 +4091,7 @@
       <w:r>
         <w:t xml:space="preserve">  ·  </w:t>
       </w:r>
-      <w:hyperlink r:id="rId24">
+      <w:hyperlink r:id="rId23">
         <w:r>
           <w:rPr>
             <w:color w:val="155D79"/>
@@ -4103,7 +4103,7 @@
       <w:r>
         <w:t xml:space="preserve">  ·  </w:t>
       </w:r>
-      <w:hyperlink r:id="rId25">
+      <w:hyperlink r:id="rId24">
         <w:r>
           <w:rPr>
             <w:color w:val="155D79"/>
@@ -4138,7 +4138,7 @@
       <w:r>
         <w:t xml:space="preserve">Bronnen en prijscontrole: </w:t>
       </w:r>
-      <w:hyperlink r:id="rId17">
+      <w:hyperlink r:id="rId16">
         <w:r>
           <w:rPr>
             <w:color w:val="155D79"/>
@@ -4150,7 +4150,7 @@
       <w:r>
         <w:t xml:space="preserve">  ·  </w:t>
       </w:r>
-      <w:hyperlink r:id="rId16">
+      <w:hyperlink r:id="rId15">
         <w:r>
           <w:rPr>
             <w:color w:val="155D79"/>
@@ -4893,7 +4893,7 @@
       <w:r>
         <w:t xml:space="preserve">Bronnen en prijscontrole: </w:t>
       </w:r>
-      <w:hyperlink r:id="rId18">
+      <w:hyperlink r:id="rId17">
         <w:r>
           <w:rPr>
             <w:color w:val="155D79"/>
@@ -4905,7 +4905,7 @@
       <w:r>
         <w:t xml:space="preserve">  ·  </w:t>
       </w:r>
-      <w:hyperlink r:id="rId26">
+      <w:hyperlink r:id="rId25">
         <w:r>
           <w:rPr>
             <w:color w:val="155D79"/>
@@ -4917,7 +4917,7 @@
       <w:r>
         <w:t xml:space="preserve">  ·  </w:t>
       </w:r>
-      <w:hyperlink r:id="rId13">
+      <w:hyperlink r:id="rId12">
         <w:r>
           <w:rPr>
             <w:color w:val="155D79"/>
@@ -4929,7 +4929,7 @@
       <w:r>
         <w:t xml:space="preserve">  ·  </w:t>
       </w:r>
-      <w:hyperlink r:id="rId14">
+      <w:hyperlink r:id="rId13">
         <w:r>
           <w:rPr>
             <w:color w:val="155D79"/>
@@ -4941,7 +4941,7 @@
       <w:r>
         <w:t xml:space="preserve">  ·  </w:t>
       </w:r>
-      <w:hyperlink r:id="rId16">
+      <w:hyperlink r:id="rId15">
         <w:r>
           <w:rPr>
             <w:color w:val="155D79"/>
@@ -4953,7 +4953,7 @@
       <w:r>
         <w:t xml:space="preserve">  ·  </w:t>
       </w:r>
-      <w:hyperlink r:id="rId27">
+      <w:hyperlink r:id="rId26">
         <w:r>
           <w:rPr>
             <w:color w:val="155D79"/>
@@ -4965,7 +4965,7 @@
       <w:r>
         <w:t xml:space="preserve">  ·  </w:t>
       </w:r>
-      <w:hyperlink r:id="rId17">
+      <w:hyperlink r:id="rId16">
         <w:r>
           <w:rPr>
             <w:color w:val="155D79"/>
@@ -4977,7 +4977,7 @@
       <w:r>
         <w:t xml:space="preserve">  ·  </w:t>
       </w:r>
-      <w:hyperlink r:id="rId28">
+      <w:hyperlink r:id="rId27">
         <w:r>
           <w:rPr>
             <w:color w:val="155D79"/>
@@ -4989,7 +4989,7 @@
       <w:r>
         <w:t xml:space="preserve">  ·  </w:t>
       </w:r>
-      <w:hyperlink r:id="rId15">
+      <w:hyperlink r:id="rId14">
         <w:r>
           <w:rPr>
             <w:color w:val="155D79"/>
@@ -5001,7 +5001,7 @@
       <w:r>
         <w:t xml:space="preserve">  ·  </w:t>
       </w:r>
-      <w:hyperlink r:id="rId29">
+      <w:hyperlink r:id="rId28">
         <w:r>
           <w:rPr>
             <w:color w:val="155D79"/>
@@ -5051,7 +5051,7 @@
       <w:r>
         <w:t xml:space="preserve">Bronnen en prijscontrole: </w:t>
       </w:r>
-      <w:hyperlink r:id="rId11">
+      <w:hyperlink r:id="rId10">
         <w:r>
           <w:rPr>
             <w:color w:val="155D79"/>
@@ -5063,7 +5063,7 @@
       <w:r>
         <w:t xml:space="preserve">  ·  </w:t>
       </w:r>
-      <w:hyperlink r:id="rId30">
+      <w:hyperlink r:id="rId29">
         <w:r>
           <w:rPr>
             <w:color w:val="155D79"/>
@@ -5098,7 +5098,7 @@
       <w:r>
         <w:t xml:space="preserve">Bronnen en prijscontrole: </w:t>
       </w:r>
-      <w:hyperlink r:id="rId10">
+      <w:hyperlink r:id="rId9">
         <w:r>
           <w:rPr>
             <w:color w:val="155D79"/>
@@ -5138,7 +5138,7 @@
       <w:r>
         <w:t xml:space="preserve">Bronnen en prijscontrole: </w:t>
       </w:r>
-      <w:hyperlink r:id="rId31">
+      <w:hyperlink r:id="rId30">
         <w:r>
           <w:rPr>
             <w:color w:val="155D79"/>
@@ -5150,7 +5150,7 @@
       <w:r>
         <w:t xml:space="preserve">  ·  </w:t>
       </w:r>
-      <w:hyperlink r:id="rId32">
+      <w:hyperlink r:id="rId31">
         <w:r>
           <w:rPr>
             <w:color w:val="155D79"/>
@@ -5185,7 +5185,7 @@
       <w:r>
         <w:t xml:space="preserve">Bronnen en prijscontrole: </w:t>
       </w:r>
-      <w:hyperlink r:id="rId33">
+      <w:hyperlink r:id="rId32">
         <w:r>
           <w:rPr>
             <w:color w:val="155D79"/>
@@ -5197,7 +5197,7 @@
       <w:r>
         <w:t xml:space="preserve">  ·  </w:t>
       </w:r>
-      <w:hyperlink r:id="rId34">
+      <w:hyperlink r:id="rId33">
         <w:r>
           <w:rPr>
             <w:color w:val="155D79"/>
@@ -5209,7 +5209,7 @@
       <w:r>
         <w:t xml:space="preserve">  ·  </w:t>
       </w:r>
-      <w:hyperlink r:id="rId35">
+      <w:hyperlink r:id="rId34">
         <w:r>
           <w:rPr>
             <w:color w:val="155D79"/>
@@ -5673,7 +5673,7 @@
       <w:r>
         <w:t xml:space="preserve">Bronnen en prijscontrole: </w:t>
       </w:r>
-      <w:hyperlink r:id="rId36">
+      <w:hyperlink r:id="rId35">
         <w:r>
           <w:rPr>
             <w:color w:val="155D79"/>
@@ -5685,7 +5685,7 @@
       <w:r>
         <w:t xml:space="preserve">  ·  </w:t>
       </w:r>
-      <w:hyperlink r:id="rId37">
+      <w:hyperlink r:id="rId36">
         <w:r>
           <w:rPr>
             <w:color w:val="155D79"/>
@@ -5697,7 +5697,7 @@
       <w:r>
         <w:t xml:space="preserve">  ·  </w:t>
       </w:r>
-      <w:hyperlink r:id="rId38">
+      <w:hyperlink r:id="rId37">
         <w:r>
           <w:rPr>
             <w:color w:val="155D79"/>
@@ -5709,7 +5709,7 @@
       <w:r>
         <w:t xml:space="preserve">  ·  </w:t>
       </w:r>
-      <w:hyperlink r:id="rId39">
+      <w:hyperlink r:id="rId38">
         <w:r>
           <w:rPr>
             <w:color w:val="155D79"/>
@@ -5721,7 +5721,7 @@
       <w:r>
         <w:t xml:space="preserve">  ·  </w:t>
       </w:r>
-      <w:hyperlink r:id="rId40">
+      <w:hyperlink r:id="rId39">
         <w:r>
           <w:rPr>
             <w:color w:val="155D79"/>
@@ -5733,7 +5733,7 @@
       <w:r>
         <w:t xml:space="preserve">  ·  </w:t>
       </w:r>
-      <w:hyperlink r:id="rId41">
+      <w:hyperlink r:id="rId40">
         <w:r>
           <w:rPr>
             <w:color w:val="155D79"/>
@@ -5782,13 +5782,18 @@
       </w:r>
     </w:p>
     <w:p>
+      <w:r>
+        <w:t>Twee eetadressen om ter plekke te bekijken, niet om jullie dag omheen te bouwen: in een lokaal forum werden Bún Chả Gầm Cầu aan Gầm Cầu en Bánh Cuốn Thanh Vân aan Hàng Gà aangeraden. Kijk of ze nog open zijn, wat de actuele menukaart kost en of het druk is met lokale gasten. Voor een spontaan alternatief hoef je in de Old Quarter nooit ver te lopen.</w:t>
+      </w:r>
+    </w:p>
+    <w:p>
       <w:pPr>
         <w:pStyle w:val="Source"/>
       </w:pPr>
       <w:r>
         <w:t xml:space="preserve">Bronnen en prijscontrole: </w:t>
       </w:r>
-      <w:hyperlink r:id="rId11">
+      <w:hyperlink r:id="rId10">
         <w:r>
           <w:rPr>
             <w:color w:val="155D79"/>
@@ -5800,7 +5805,7 @@
       <w:r>
         <w:t xml:space="preserve">  ·  </w:t>
       </w:r>
-      <w:hyperlink r:id="rId42">
+      <w:hyperlink r:id="rId41">
         <w:r>
           <w:rPr>
             <w:color w:val="155D79"/>
@@ -5812,7 +5817,7 @@
       <w:r>
         <w:t xml:space="preserve">  ·  </w:t>
       </w:r>
-      <w:hyperlink r:id="rId11">
+      <w:hyperlink r:id="rId10">
         <w:r>
           <w:rPr>
             <w:color w:val="155D79"/>
@@ -5824,7 +5829,7 @@
       <w:r>
         <w:t xml:space="preserve">  ·  </w:t>
       </w:r>
-      <w:hyperlink r:id="rId43">
+      <w:hyperlink r:id="rId42">
         <w:r>
           <w:rPr>
             <w:color w:val="155D79"/>
@@ -5836,7 +5841,7 @@
       <w:r>
         <w:t xml:space="preserve">  ·  </w:t>
       </w:r>
-      <w:hyperlink r:id="rId44">
+      <w:hyperlink r:id="rId43">
         <w:r>
           <w:rPr>
             <w:color w:val="155D79"/>
@@ -5845,6 +5850,18 @@
           <w:t>X-Men Gym reizigersinformatie</w:t>
         </w:r>
       </w:hyperlink>
+      <w:r>
+        <w:t xml:space="preserve">  ·  </w:t>
+      </w:r>
+      <w:hyperlink r:id="rId44">
+        <w:r>
+          <w:rPr>
+            <w:color w:val="155D79"/>
+            <w:u w:val="single"/>
+          </w:rPr>
+          <w:t>Forum lokale eetadressen Hanoi</w:t>
+        </w:r>
+      </w:hyperlink>
     </w:p>
     <w:p>
       <w:pPr>
@@ -5871,7 +5888,7 @@
       <w:r>
         <w:t xml:space="preserve">Bronnen en prijscontrole: </w:t>
       </w:r>
-      <w:hyperlink r:id="rId10">
+      <w:hyperlink r:id="rId9">
         <w:r>
           <w:rPr>
             <w:color w:val="155D79"/>
@@ -5924,13 +5941,18 @@
       </w:r>
     </w:p>
     <w:p>
+      <w:r>
+        <w:t>Voor eten in Tam Cốc zijn forumervaringen opvallend verdeeld. Een reiziger noemt Xá Ớt Noodle Bar en Đầm Khê Speciality Coffee prettig; een ander vond juist veel populaire zaken matig en noemt opgeblazen online beoordelingen. Gebruik deze namen als proefopties, loop ook kleinere zijstraten in en bestel geen verre taxi voor één recensie.</w:t>
+      </w:r>
+    </w:p>
+    <w:p>
       <w:pPr>
         <w:pStyle w:val="Source"/>
       </w:pPr>
       <w:r>
         <w:t xml:space="preserve">Bronnen en prijscontrole: </w:t>
       </w:r>
-      <w:hyperlink r:id="rId31">
+      <w:hyperlink r:id="rId30">
         <w:r>
           <w:rPr>
             <w:color w:val="155D79"/>
@@ -5942,7 +5964,7 @@
       <w:r>
         <w:t xml:space="preserve">  ·  </w:t>
       </w:r>
-      <w:hyperlink r:id="rId32">
+      <w:hyperlink r:id="rId31">
         <w:r>
           <w:rPr>
             <w:color w:val="155D79"/>
@@ -5987,6 +6009,18 @@
           <w:t>Tam Cốc Gym dagpas ervaringen</w:t>
         </w:r>
       </w:hyperlink>
+      <w:r>
+        <w:t xml:space="preserve">  ·  </w:t>
+      </w:r>
+      <w:hyperlink r:id="rId50">
+        <w:r>
+          <w:rPr>
+            <w:color w:val="155D79"/>
+            <w:u w:val="single"/>
+          </w:rPr>
+          <w:t>Forum eten in Tam Cốc met uiteenlopende ervaringen</w:t>
+        </w:r>
+      </w:hyperlink>
     </w:p>
     <w:p>
       <w:pPr>
@@ -6007,13 +6041,18 @@
       </w:r>
     </w:p>
     <w:p>
+      <w:r>
+        <w:t>Bij Hồ Thị Kỷ noemen bezoekers bò lá lốt als gerecht om te proberen; neem contante dong mee en kies ter plekke een drukke kraam. De markt onder de Nguyễn Thiện Thuật-flats in District 3 wordt in een ander forum als alternatief genoemd, maar zou ik alleen toevoegen als jullie toch die kant op gaan. Zo blijft eten ontdekken een avondwandeling, geen uitgekiende foodroute.</w:t>
+      </w:r>
+    </w:p>
+    <w:p>
       <w:pPr>
         <w:pStyle w:val="Source"/>
       </w:pPr>
       <w:r>
         <w:t xml:space="preserve">Bronnen en prijscontrole: </w:t>
       </w:r>
-      <w:hyperlink r:id="rId50">
+      <w:hyperlink r:id="rId51">
         <w:r>
           <w:rPr>
             <w:color w:val="155D79"/>
@@ -6025,7 +6064,7 @@
       <w:r>
         <w:t xml:space="preserve">  ·  </w:t>
       </w:r>
-      <w:hyperlink r:id="rId51">
+      <w:hyperlink r:id="rId52">
         <w:r>
           <w:rPr>
             <w:color w:val="155D79"/>
@@ -6037,7 +6076,7 @@
       <w:r>
         <w:t xml:space="preserve">  ·  </w:t>
       </w:r>
-      <w:hyperlink r:id="rId52">
+      <w:hyperlink r:id="rId53">
         <w:r>
           <w:rPr>
             <w:color w:val="155D79"/>
@@ -6046,6 +6085,18 @@
           <w:t>C'Gym dagpas en adres</w:t>
         </w:r>
       </w:hyperlink>
+      <w:r>
+        <w:t xml:space="preserve">  ·  </w:t>
+      </w:r>
+      <w:hyperlink r:id="rId54">
+        <w:r>
+          <w:rPr>
+            <w:color w:val="155D79"/>
+            <w:u w:val="single"/>
+          </w:rPr>
+          <w:t>Forum streetfood Hồ Thị Kỷ</w:t>
+        </w:r>
+      </w:hyperlink>
     </w:p>
     <w:p>
       <w:pPr>
@@ -6077,7 +6128,7 @@
       <w:r>
         <w:t xml:space="preserve">Bronnen en prijscontrole: </w:t>
       </w:r>
-      <w:hyperlink r:id="rId36">
+      <w:hyperlink r:id="rId35">
         <w:r>
           <w:rPr>
             <w:color w:val="155D79"/>
@@ -6089,7 +6140,7 @@
       <w:r>
         <w:t xml:space="preserve">  ·  </w:t>
       </w:r>
-      <w:hyperlink r:id="rId38">
+      <w:hyperlink r:id="rId37">
         <w:r>
           <w:rPr>
             <w:color w:val="155D79"/>
@@ -6101,7 +6152,7 @@
       <w:r>
         <w:t xml:space="preserve">  ·  </w:t>
       </w:r>
-      <w:hyperlink r:id="rId53">
+      <w:hyperlink r:id="rId55">
         <w:r>
           <w:rPr>
             <w:color w:val="155D79"/>
@@ -6113,7 +6164,7 @@
       <w:r>
         <w:t xml:space="preserve">  ·  </w:t>
       </w:r>
-      <w:hyperlink r:id="rId54">
+      <w:hyperlink r:id="rId56">
         <w:r>
           <w:rPr>
             <w:color w:val="155D79"/>
@@ -6125,7 +6176,7 @@
       <w:r>
         <w:t xml:space="preserve">  ·  </w:t>
       </w:r>
-      <w:hyperlink r:id="rId55">
+      <w:hyperlink r:id="rId57">
         <w:r>
           <w:rPr>
             <w:color w:val="155D79"/>
@@ -6137,7 +6188,7 @@
       <w:r>
         <w:t xml:space="preserve">  ·  </w:t>
       </w:r>
-      <w:hyperlink r:id="rId56">
+      <w:hyperlink r:id="rId58">
         <w:r>
           <w:rPr>
             <w:color w:val="155D79"/>
@@ -6860,7 +6911,7 @@
       <w:r>
         <w:t xml:space="preserve">Bronnen en prijscontrole: </w:t>
       </w:r>
-      <w:hyperlink r:id="rId18">
+      <w:hyperlink r:id="rId17">
         <w:r>
           <w:rPr>
             <w:color w:val="155D79"/>
@@ -6872,7 +6923,7 @@
       <w:r>
         <w:t xml:space="preserve">  ·  </w:t>
       </w:r>
-      <w:hyperlink r:id="rId26">
+      <w:hyperlink r:id="rId25">
         <w:r>
           <w:rPr>
             <w:color w:val="155D79"/>
@@ -6884,7 +6935,7 @@
       <w:r>
         <w:t xml:space="preserve">  ·  </w:t>
       </w:r>
-      <w:hyperlink r:id="rId16">
+      <w:hyperlink r:id="rId15">
         <w:r>
           <w:rPr>
             <w:color w:val="155D79"/>
@@ -6896,7 +6947,7 @@
       <w:r>
         <w:t xml:space="preserve">  ·  </w:t>
       </w:r>
-      <w:hyperlink r:id="rId17">
+      <w:hyperlink r:id="rId16">
         <w:r>
           <w:rPr>
             <w:color w:val="155D79"/>
@@ -6908,7 +6959,7 @@
       <w:r>
         <w:t xml:space="preserve">  ·  </w:t>
       </w:r>
-      <w:hyperlink r:id="rId27">
+      <w:hyperlink r:id="rId26">
         <w:r>
           <w:rPr>
             <w:color w:val="155D79"/>
@@ -6920,7 +6971,7 @@
       <w:r>
         <w:t xml:space="preserve">  ·  </w:t>
       </w:r>
-      <w:hyperlink r:id="rId28">
+      <w:hyperlink r:id="rId27">
         <w:r>
           <w:rPr>
             <w:color w:val="155D79"/>
@@ -6932,7 +6983,7 @@
       <w:r>
         <w:t xml:space="preserve">  ·  </w:t>
       </w:r>
-      <w:hyperlink r:id="rId33">
+      <w:hyperlink r:id="rId32">
         <w:r>
           <w:rPr>
             <w:color w:val="155D79"/>
@@ -6944,7 +6995,7 @@
       <w:r>
         <w:t xml:space="preserve">  ·  </w:t>
       </w:r>
-      <w:hyperlink r:id="rId57">
+      <w:hyperlink r:id="rId59">
         <w:r>
           <w:rPr>
             <w:color w:val="155D79"/>
@@ -6956,7 +7007,7 @@
       <w:r>
         <w:t xml:space="preserve">  ·  </w:t>
       </w:r>
-      <w:hyperlink r:id="rId34">
+      <w:hyperlink r:id="rId33">
         <w:r>
           <w:rPr>
             <w:color w:val="155D79"/>
@@ -6968,7 +7019,7 @@
       <w:r>
         <w:t xml:space="preserve">  ·  </w:t>
       </w:r>
-      <w:hyperlink r:id="rId58">
+      <w:hyperlink r:id="rId60">
         <w:r>
           <w:rPr>
             <w:color w:val="155D79"/>
@@ -6980,7 +7031,7 @@
       <w:r>
         <w:t xml:space="preserve">  ·  </w:t>
       </w:r>
-      <w:hyperlink r:id="rId59">
+      <w:hyperlink r:id="rId61">
         <w:r>
           <w:rPr>
             <w:color w:val="155D79"/>
@@ -6992,7 +7043,7 @@
       <w:r>
         <w:t xml:space="preserve">  ·  </w:t>
       </w:r>
-      <w:hyperlink r:id="rId60">
+      <w:hyperlink r:id="rId62">
         <w:r>
           <w:rPr>
             <w:color w:val="155D79"/>
@@ -7004,7 +7055,7 @@
       <w:r>
         <w:t xml:space="preserve">  ·  </w:t>
       </w:r>
-      <w:hyperlink r:id="rId61">
+      <w:hyperlink r:id="rId63">
         <w:r>
           <w:rPr>
             <w:color w:val="155D79"/>
@@ -7360,7 +7411,7 @@
       <w:r>
         <w:t xml:space="preserve">Bronnen en prijscontrole: </w:t>
       </w:r>
-      <w:hyperlink r:id="rId62">
+      <w:hyperlink r:id="rId64">
         <w:r>
           <w:rPr>
             <w:color w:val="155D79"/>
@@ -7372,7 +7423,7 @@
       <w:r>
         <w:t xml:space="preserve">  ·  </w:t>
       </w:r>
-      <w:hyperlink r:id="rId63">
+      <w:hyperlink r:id="rId65">
         <w:r>
           <w:rPr>
             <w:color w:val="155D79"/>
@@ -7384,7 +7435,7 @@
       <w:r>
         <w:t xml:space="preserve">  ·  </w:t>
       </w:r>
-      <w:hyperlink r:id="rId64">
+      <w:hyperlink r:id="rId66">
         <w:r>
           <w:rPr>
             <w:color w:val="155D79"/>
@@ -7396,7 +7447,7 @@
       <w:r>
         <w:t xml:space="preserve">  ·  </w:t>
       </w:r>
-      <w:hyperlink r:id="rId65">
+      <w:hyperlink r:id="rId67">
         <w:r>
           <w:rPr>
             <w:color w:val="155D79"/>
@@ -7844,7 +7895,7 @@
       <w:r>
         <w:t xml:space="preserve">Bronnen en prijscontrole: </w:t>
       </w:r>
-      <w:hyperlink r:id="rId66">
+      <w:hyperlink r:id="rId68">
         <w:r>
           <w:rPr>
             <w:color w:val="155D79"/>
@@ -7856,7 +7907,7 @@
       <w:r>
         <w:t xml:space="preserve">  ·  </w:t>
       </w:r>
-      <w:hyperlink r:id="rId67">
+      <w:hyperlink r:id="rId69">
         <w:r>
           <w:rPr>
             <w:color w:val="155D79"/>
@@ -7868,7 +7919,7 @@
       <w:r>
         <w:t xml:space="preserve">  ·  </w:t>
       </w:r>
-      <w:hyperlink r:id="rId65">
+      <w:hyperlink r:id="rId67">
         <w:r>
           <w:rPr>
             <w:color w:val="155D79"/>
@@ -7930,7 +7981,7 @@
       <w:r>
         <w:t xml:space="preserve">Bronnen en prijscontrole: </w:t>
       </w:r>
-      <w:hyperlink r:id="rId68">
+      <w:hyperlink r:id="rId70">
         <w:r>
           <w:rPr>
             <w:color w:val="155D79"/>
@@ -7942,7 +7993,7 @@
       <w:r>
         <w:t xml:space="preserve">  ·  </w:t>
       </w:r>
-      <w:hyperlink r:id="rId69">
+      <w:hyperlink r:id="rId71">
         <w:r>
           <w:rPr>
             <w:color w:val="155D79"/>
@@ -7954,7 +8005,7 @@
       <w:r>
         <w:t xml:space="preserve">  ·  </w:t>
       </w:r>
-      <w:hyperlink r:id="rId70">
+      <w:hyperlink r:id="rId72">
         <w:r>
           <w:rPr>
             <w:color w:val="155D79"/>
@@ -7966,7 +8017,7 @@
       <w:r>
         <w:t xml:space="preserve">  ·  </w:t>
       </w:r>
-      <w:hyperlink r:id="rId71">
+      <w:hyperlink r:id="rId73">
         <w:r>
           <w:rPr>
             <w:color w:val="155D79"/>
@@ -8001,7 +8052,7 @@
       <w:r>
         <w:t xml:space="preserve">Bronnen en prijscontrole: </w:t>
       </w:r>
-      <w:hyperlink r:id="rId72">
+      <w:hyperlink r:id="rId74">
         <w:r>
           <w:rPr>
             <w:color w:val="155D79"/>
@@ -8013,7 +8064,7 @@
       <w:r>
         <w:t xml:space="preserve">  ·  </w:t>
       </w:r>
-      <w:hyperlink r:id="rId62">
+      <w:hyperlink r:id="rId64">
         <w:r>
           <w:rPr>
             <w:color w:val="155D79"/>
@@ -8025,7 +8076,7 @@
       <w:r>
         <w:t xml:space="preserve">  ·  </w:t>
       </w:r>
-      <w:hyperlink r:id="rId63">
+      <w:hyperlink r:id="rId65">
         <w:r>
           <w:rPr>
             <w:color w:val="155D79"/>
@@ -8037,7 +8088,7 @@
       <w:r>
         <w:t xml:space="preserve">  ·  </w:t>
       </w:r>
-      <w:hyperlink r:id="rId57">
+      <w:hyperlink r:id="rId59">
         <w:r>
           <w:rPr>
             <w:color w:val="155D79"/>
@@ -8782,7 +8833,7 @@
       <w:r>
         <w:t xml:space="preserve">Bronnen en prijscontrole: </w:t>
       </w:r>
-      <w:hyperlink r:id="rId73">
+      <w:hyperlink r:id="rId75">
         <w:r>
           <w:rPr>
             <w:color w:val="155D79"/>
@@ -8794,7 +8845,7 @@
       <w:r>
         <w:t xml:space="preserve">  ·  </w:t>
       </w:r>
-      <w:hyperlink r:id="rId74">
+      <w:hyperlink r:id="rId76">
         <w:r>
           <w:rPr>
             <w:color w:val="155D79"/>
@@ -8806,7 +8857,7 @@
       <w:r>
         <w:t xml:space="preserve">  ·  </w:t>
       </w:r>
-      <w:hyperlink r:id="rId75">
+      <w:hyperlink r:id="rId77">
         <w:r>
           <w:rPr>
             <w:color w:val="155D79"/>
@@ -8818,7 +8869,7 @@
       <w:r>
         <w:t xml:space="preserve">  ·  </w:t>
       </w:r>
-      <w:hyperlink r:id="rId36">
+      <w:hyperlink r:id="rId35">
         <w:r>
           <w:rPr>
             <w:color w:val="155D79"/>
@@ -8830,7 +8881,7 @@
       <w:r>
         <w:t xml:space="preserve">  ·  </w:t>
       </w:r>
-      <w:hyperlink r:id="rId37">
+      <w:hyperlink r:id="rId36">
         <w:r>
           <w:rPr>
             <w:color w:val="155D79"/>
@@ -8842,7 +8893,7 @@
       <w:r>
         <w:t xml:space="preserve">  ·  </w:t>
       </w:r>
-      <w:hyperlink r:id="rId13">
+      <w:hyperlink r:id="rId12">
         <w:r>
           <w:rPr>
             <w:color w:val="155D79"/>
@@ -8854,7 +8905,7 @@
       <w:r>
         <w:t xml:space="preserve">  ·  </w:t>
       </w:r>
-      <w:hyperlink r:id="rId17">
+      <w:hyperlink r:id="rId16">
         <w:r>
           <w:rPr>
             <w:color w:val="155D79"/>
@@ -8935,7 +8986,7 @@
       <w:r>
         <w:t xml:space="preserve">Bronnen en prijscontrole: </w:t>
       </w:r>
-      <w:hyperlink r:id="rId76">
+      <w:hyperlink r:id="rId78">
         <w:r>
           <w:rPr>
             <w:color w:val="155D79"/>
@@ -8947,7 +8998,7 @@
       <w:r>
         <w:t xml:space="preserve">  ·  </w:t>
       </w:r>
-      <w:hyperlink r:id="rId77">
+      <w:hyperlink r:id="rId79">
         <w:r>
           <w:rPr>
             <w:color w:val="155D79"/>
@@ -8959,7 +9010,7 @@
       <w:r>
         <w:t xml:space="preserve">  ·  </w:t>
       </w:r>
-      <w:hyperlink r:id="rId78">
+      <w:hyperlink r:id="rId80">
         <w:r>
           <w:rPr>
             <w:color w:val="155D79"/>
@@ -8971,7 +9022,7 @@
       <w:r>
         <w:t xml:space="preserve">  ·  </w:t>
       </w:r>
-      <w:hyperlink r:id="rId30">
+      <w:hyperlink r:id="rId29">
         <w:r>
           <w:rPr>
             <w:color w:val="155D79"/>
@@ -8983,7 +9034,7 @@
       <w:r>
         <w:t xml:space="preserve">  ·  </w:t>
       </w:r>
-      <w:hyperlink r:id="rId35">
+      <w:hyperlink r:id="rId34">
         <w:r>
           <w:rPr>
             <w:color w:val="155D79"/>
@@ -9145,7 +9196,7 @@
       <w:r>
         <w:t xml:space="preserve">Bronnen en prijscontrole: </w:t>
       </w:r>
-      <w:hyperlink r:id="rId76">
+      <w:hyperlink r:id="rId78">
         <w:r>
           <w:rPr>
             <w:color w:val="155D79"/>
@@ -9157,7 +9208,7 @@
       <w:r>
         <w:t xml:space="preserve">  ·  </w:t>
       </w:r>
-      <w:hyperlink r:id="rId78">
+      <w:hyperlink r:id="rId80">
         <w:r>
           <w:rPr>
             <w:color w:val="155D79"/>
@@ -9169,7 +9220,7 @@
       <w:r>
         <w:t xml:space="preserve">  ·  </w:t>
       </w:r>
-      <w:hyperlink r:id="rId66">
+      <w:hyperlink r:id="rId68">
         <w:r>
           <w:rPr>
             <w:color w:val="155D79"/>
@@ -9181,7 +9232,7 @@
       <w:r>
         <w:t xml:space="preserve">  ·  </w:t>
       </w:r>
-      <w:hyperlink r:id="rId63">
+      <w:hyperlink r:id="rId65">
         <w:r>
           <w:rPr>
             <w:color w:val="155D79"/>
@@ -9193,7 +9244,7 @@
       <w:r>
         <w:t xml:space="preserve">  ·  </w:t>
       </w:r>
-      <w:hyperlink r:id="rId72">
+      <w:hyperlink r:id="rId74">
         <w:r>
           <w:rPr>
             <w:color w:val="155D79"/>
@@ -9353,7 +9404,7 @@
       <w:r>
         <w:t xml:space="preserve">Bronnen en prijscontrole: </w:t>
       </w:r>
-      <w:hyperlink r:id="rId30">
+      <w:hyperlink r:id="rId29">
         <w:r>
           <w:rPr>
             <w:color w:val="155D79"/>
@@ -9365,7 +9416,7 @@
       <w:r>
         <w:t xml:space="preserve">  ·  </w:t>
       </w:r>
-      <w:hyperlink r:id="rId76">
+      <w:hyperlink r:id="rId78">
         <w:r>
           <w:rPr>
             <w:color w:val="155D79"/>
@@ -9377,7 +9428,7 @@
       <w:r>
         <w:t xml:space="preserve">  ·  </w:t>
       </w:r>
-      <w:hyperlink r:id="rId62">
+      <w:hyperlink r:id="rId64">
         <w:r>
           <w:rPr>
             <w:color w:val="155D79"/>
@@ -9389,7 +9440,7 @@
       <w:r>
         <w:t xml:space="preserve">  ·  </w:t>
       </w:r>
-      <w:hyperlink r:id="rId63">
+      <w:hyperlink r:id="rId65">
         <w:r>
           <w:rPr>
             <w:color w:val="155D79"/>
@@ -9428,7 +9479,7 @@
       </w:r>
     </w:p>
     <w:p>
-      <w:hyperlink r:id="rId30">
+      <w:hyperlink r:id="rId29">
         <w:r>
           <w:rPr>
             <w:color w:val="155D79"/>
@@ -9440,7 +9491,7 @@
       <w:r>
         <w:t xml:space="preserve">  ·  </w:t>
       </w:r>
-      <w:hyperlink r:id="rId78">
+      <w:hyperlink r:id="rId80">
         <w:r>
           <w:rPr>
             <w:color w:val="155D79"/>
@@ -9452,7 +9503,7 @@
       <w:r>
         <w:t xml:space="preserve">  ·  </w:t>
       </w:r>
-      <w:hyperlink r:id="rId76">
+      <w:hyperlink r:id="rId78">
         <w:r>
           <w:rPr>
             <w:color w:val="155D79"/>
@@ -9464,7 +9515,7 @@
       <w:r>
         <w:t xml:space="preserve">  ·  </w:t>
       </w:r>
-      <w:hyperlink r:id="rId77">
+      <w:hyperlink r:id="rId79">
         <w:r>
           <w:rPr>
             <w:color w:val="155D79"/>
@@ -9476,7 +9527,7 @@
       <w:r>
         <w:t xml:space="preserve">  ·  </w:t>
       </w:r>
-      <w:hyperlink r:id="rId35">
+      <w:hyperlink r:id="rId34">
         <w:r>
           <w:rPr>
             <w:color w:val="155D79"/>
@@ -9495,7 +9546,7 @@
       </w:r>
     </w:p>
     <w:p>
-      <w:hyperlink r:id="rId12">
+      <w:hyperlink r:id="rId11">
         <w:r>
           <w:rPr>
             <w:color w:val="155D79"/>
@@ -9507,7 +9558,7 @@
       <w:r>
         <w:t xml:space="preserve">  ·  </w:t>
       </w:r>
-      <w:hyperlink r:id="rId18">
+      <w:hyperlink r:id="rId17">
         <w:r>
           <w:rPr>
             <w:color w:val="155D79"/>
@@ -9519,7 +9570,7 @@
       <w:r>
         <w:t xml:space="preserve">  ·  </w:t>
       </w:r>
-      <w:hyperlink r:id="rId23">
+      <w:hyperlink r:id="rId22">
         <w:r>
           <w:rPr>
             <w:color w:val="155D79"/>
@@ -9531,7 +9582,7 @@
       <w:r>
         <w:t xml:space="preserve">  ·  </w:t>
       </w:r>
-      <w:hyperlink r:id="rId79">
+      <w:hyperlink r:id="rId81">
         <w:r>
           <w:rPr>
             <w:color w:val="155D79"/>
@@ -9543,7 +9594,7 @@
       <w:r>
         <w:t xml:space="preserve">  ·  </w:t>
       </w:r>
-      <w:hyperlink r:id="rId13">
+      <w:hyperlink r:id="rId12">
         <w:r>
           <w:rPr>
             <w:color w:val="155D79"/>
@@ -9555,7 +9606,7 @@
       <w:r>
         <w:t xml:space="preserve">  ·  </w:t>
       </w:r>
-      <w:hyperlink r:id="rId14">
+      <w:hyperlink r:id="rId13">
         <w:r>
           <w:rPr>
             <w:color w:val="155D79"/>
@@ -9567,7 +9618,7 @@
       <w:r>
         <w:t xml:space="preserve">  ·  </w:t>
       </w:r>
-      <w:hyperlink r:id="rId15">
+      <w:hyperlink r:id="rId14">
         <w:r>
           <w:rPr>
             <w:color w:val="155D79"/>
@@ -9579,7 +9630,7 @@
       <w:r>
         <w:t xml:space="preserve">  ·  </w:t>
       </w:r>
-      <w:hyperlink r:id="rId16">
+      <w:hyperlink r:id="rId15">
         <w:r>
           <w:rPr>
             <w:color w:val="155D79"/>
@@ -9591,7 +9642,7 @@
       <w:r>
         <w:t xml:space="preserve">  ·  </w:t>
       </w:r>
-      <w:hyperlink r:id="rId27">
+      <w:hyperlink r:id="rId26">
         <w:r>
           <w:rPr>
             <w:color w:val="155D79"/>
@@ -9603,7 +9654,7 @@
       <w:r>
         <w:t xml:space="preserve">  ·  </w:t>
       </w:r>
-      <w:hyperlink r:id="rId17">
+      <w:hyperlink r:id="rId16">
         <w:r>
           <w:rPr>
             <w:color w:val="155D79"/>
@@ -9615,7 +9666,7 @@
       <w:r>
         <w:t xml:space="preserve">  ·  </w:t>
       </w:r>
-      <w:hyperlink r:id="rId28">
+      <w:hyperlink r:id="rId27">
         <w:r>
           <w:rPr>
             <w:color w:val="155D79"/>
@@ -9627,7 +9678,7 @@
       <w:r>
         <w:t xml:space="preserve">  ·  </w:t>
       </w:r>
-      <w:hyperlink r:id="rId29">
+      <w:hyperlink r:id="rId28">
         <w:r>
           <w:rPr>
             <w:color w:val="155D79"/>
@@ -9646,7 +9697,7 @@
       </w:r>
     </w:p>
     <w:p>
-      <w:hyperlink r:id="rId11">
+      <w:hyperlink r:id="rId10">
         <w:r>
           <w:rPr>
             <w:color w:val="155D79"/>
@@ -9658,7 +9709,7 @@
       <w:r>
         <w:t xml:space="preserve">  ·  </w:t>
       </w:r>
-      <w:hyperlink r:id="rId10">
+      <w:hyperlink r:id="rId9">
         <w:r>
           <w:rPr>
             <w:color w:val="155D79"/>
@@ -9670,7 +9721,7 @@
       <w:r>
         <w:t xml:space="preserve">  ·  </w:t>
       </w:r>
-      <w:hyperlink r:id="rId31">
+      <w:hyperlink r:id="rId30">
         <w:r>
           <w:rPr>
             <w:color w:val="155D79"/>
@@ -9682,7 +9733,7 @@
       <w:r>
         <w:t xml:space="preserve">  ·  </w:t>
       </w:r>
-      <w:hyperlink r:id="rId32">
+      <w:hyperlink r:id="rId31">
         <w:r>
           <w:rPr>
             <w:color w:val="155D79"/>
@@ -9694,7 +9745,7 @@
       <w:r>
         <w:t xml:space="preserve">  ·  </w:t>
       </w:r>
-      <w:hyperlink r:id="rId41">
+      <w:hyperlink r:id="rId40">
         <w:r>
           <w:rPr>
             <w:color w:val="155D79"/>
@@ -9706,7 +9757,7 @@
       <w:r>
         <w:t xml:space="preserve">  ·  </w:t>
       </w:r>
-      <w:hyperlink r:id="rId38">
+      <w:hyperlink r:id="rId37">
         <w:r>
           <w:rPr>
             <w:color w:val="155D79"/>
@@ -9718,7 +9769,7 @@
       <w:r>
         <w:t xml:space="preserve">  ·  </w:t>
       </w:r>
-      <w:hyperlink r:id="rId39">
+      <w:hyperlink r:id="rId38">
         <w:r>
           <w:rPr>
             <w:color w:val="155D79"/>
@@ -9730,7 +9781,7 @@
       <w:r>
         <w:t xml:space="preserve">  ·  </w:t>
       </w:r>
-      <w:hyperlink r:id="rId36">
+      <w:hyperlink r:id="rId35">
         <w:r>
           <w:rPr>
             <w:color w:val="155D79"/>
@@ -9742,7 +9793,7 @@
       <w:r>
         <w:t xml:space="preserve">  ·  </w:t>
       </w:r>
-      <w:hyperlink r:id="rId37">
+      <w:hyperlink r:id="rId36">
         <w:r>
           <w:rPr>
             <w:color w:val="155D79"/>
@@ -9761,13 +9812,25 @@
       </w:r>
     </w:p>
     <w:p>
-      <w:hyperlink r:id="rId11">
+      <w:hyperlink r:id="rId10">
         <w:r>
           <w:rPr>
             <w:color w:val="155D79"/>
             <w:u w:val="single"/>
           </w:rPr>
           <w:t>Vietnam Tourism Old Quarter en nachtmarkt</w:t>
+        </w:r>
+      </w:hyperlink>
+      <w:r>
+        <w:t xml:space="preserve">  ·  </w:t>
+      </w:r>
+      <w:hyperlink r:id="rId44">
+        <w:r>
+          <w:rPr>
+            <w:color w:val="155D79"/>
+            <w:u w:val="single"/>
+          </w:rPr>
+          <w:t>Forum lokale eetadressen Hanoi</w:t>
         </w:r>
       </w:hyperlink>
       <w:r>
@@ -9809,6 +9872,18 @@
       <w:r>
         <w:t xml:space="preserve">  ·  </w:t>
       </w:r>
+      <w:hyperlink r:id="rId50">
+        <w:r>
+          <w:rPr>
+            <w:color w:val="155D79"/>
+            <w:u w:val="single"/>
+          </w:rPr>
+          <w:t>Forum eten in Tam Cốc met uiteenlopende ervaringen</w:t>
+        </w:r>
+      </w:hyperlink>
+      <w:r>
+        <w:t xml:space="preserve">  ·  </w:t>
+      </w:r>
       <w:hyperlink r:id="rId49">
         <w:r>
           <w:rPr>
@@ -9821,7 +9896,7 @@
       <w:r>
         <w:t xml:space="preserve">  ·  </w:t>
       </w:r>
-      <w:hyperlink r:id="rId50">
+      <w:hyperlink r:id="rId51">
         <w:r>
           <w:rPr>
             <w:color w:val="155D79"/>
@@ -9833,7 +9908,19 @@
       <w:r>
         <w:t xml:space="preserve">  ·  </w:t>
       </w:r>
-      <w:hyperlink r:id="rId52">
+      <w:hyperlink r:id="rId54">
+        <w:r>
+          <w:rPr>
+            <w:color w:val="155D79"/>
+            <w:u w:val="single"/>
+          </w:rPr>
+          <w:t>Forum streetfood Hồ Thị Kỷ</w:t>
+        </w:r>
+      </w:hyperlink>
+      <w:r>
+        <w:t xml:space="preserve">  ·  </w:t>
+      </w:r>
+      <w:hyperlink r:id="rId53">
         <w:r>
           <w:rPr>
             <w:color w:val="155D79"/>
@@ -9845,7 +9932,7 @@
       <w:r>
         <w:t xml:space="preserve">  ·  </w:t>
       </w:r>
-      <w:hyperlink r:id="rId54">
+      <w:hyperlink r:id="rId56">
         <w:r>
           <w:rPr>
             <w:color w:val="155D79"/>
@@ -9857,7 +9944,7 @@
       <w:r>
         <w:t xml:space="preserve">  ·  </w:t>
       </w:r>
-      <w:hyperlink r:id="rId56">
+      <w:hyperlink r:id="rId58">
         <w:r>
           <w:rPr>
             <w:color w:val="155D79"/>
@@ -9876,7 +9963,7 @@
       </w:r>
     </w:p>
     <w:p>
-      <w:hyperlink r:id="rId26">
+      <w:hyperlink r:id="rId25">
         <w:r>
           <w:rPr>
             <w:color w:val="155D79"/>
@@ -9888,7 +9975,7 @@
       <w:r>
         <w:t xml:space="preserve">  ·  </w:t>
       </w:r>
-      <w:hyperlink r:id="rId33">
+      <w:hyperlink r:id="rId32">
         <w:r>
           <w:rPr>
             <w:color w:val="155D79"/>
@@ -9900,7 +9987,7 @@
       <w:r>
         <w:t xml:space="preserve">  ·  </w:t>
       </w:r>
-      <w:hyperlink r:id="rId57">
+      <w:hyperlink r:id="rId59">
         <w:r>
           <w:rPr>
             <w:color w:val="155D79"/>
@@ -9912,7 +9999,7 @@
       <w:r>
         <w:t xml:space="preserve">  ·  </w:t>
       </w:r>
-      <w:hyperlink r:id="rId58">
+      <w:hyperlink r:id="rId60">
         <w:r>
           <w:rPr>
             <w:color w:val="155D79"/>
@@ -9924,7 +10011,7 @@
       <w:r>
         <w:t xml:space="preserve">  ·  </w:t>
       </w:r>
-      <w:hyperlink r:id="rId34">
+      <w:hyperlink r:id="rId33">
         <w:r>
           <w:rPr>
             <w:color w:val="155D79"/>
@@ -9936,7 +10023,7 @@
       <w:r>
         <w:t xml:space="preserve">  ·  </w:t>
       </w:r>
-      <w:hyperlink r:id="rId59">
+      <w:hyperlink r:id="rId61">
         <w:r>
           <w:rPr>
             <w:color w:val="155D79"/>
@@ -9948,7 +10035,7 @@
       <w:r>
         <w:t xml:space="preserve">  ·  </w:t>
       </w:r>
-      <w:hyperlink r:id="rId60">
+      <w:hyperlink r:id="rId62">
         <w:r>
           <w:rPr>
             <w:color w:val="155D79"/>
@@ -9960,7 +10047,7 @@
       <w:r>
         <w:t xml:space="preserve">  ·  </w:t>
       </w:r>
-      <w:hyperlink r:id="rId62">
+      <w:hyperlink r:id="rId64">
         <w:r>
           <w:rPr>
             <w:color w:val="155D79"/>
@@ -9972,7 +10059,7 @@
       <w:r>
         <w:t xml:space="preserve">  ·  </w:t>
       </w:r>
-      <w:hyperlink r:id="rId66">
+      <w:hyperlink r:id="rId68">
         <w:r>
           <w:rPr>
             <w:color w:val="155D79"/>
@@ -9984,7 +10071,7 @@
       <w:r>
         <w:t xml:space="preserve">  ·  </w:t>
       </w:r>
-      <w:hyperlink r:id="rId63">
+      <w:hyperlink r:id="rId65">
         <w:r>
           <w:rPr>
             <w:color w:val="155D79"/>
@@ -9996,7 +10083,7 @@
       <w:r>
         <w:t xml:space="preserve">  ·  </w:t>
       </w:r>
-      <w:hyperlink r:id="rId64">
+      <w:hyperlink r:id="rId66">
         <w:r>
           <w:rPr>
             <w:color w:val="155D79"/>
@@ -10008,7 +10095,7 @@
       <w:r>
         <w:t xml:space="preserve">  ·  </w:t>
       </w:r>
-      <w:hyperlink r:id="rId65">
+      <w:hyperlink r:id="rId67">
         <w:r>
           <w:rPr>
             <w:color w:val="155D79"/>
@@ -10020,7 +10107,7 @@
       <w:r>
         <w:t xml:space="preserve">  ·  </w:t>
       </w:r>
-      <w:hyperlink r:id="rId67">
+      <w:hyperlink r:id="rId69">
         <w:r>
           <w:rPr>
             <w:color w:val="155D79"/>
@@ -10032,7 +10119,7 @@
       <w:r>
         <w:t xml:space="preserve">  ·  </w:t>
       </w:r>
-      <w:hyperlink r:id="rId72">
+      <w:hyperlink r:id="rId74">
         <w:r>
           <w:rPr>
             <w:color w:val="155D79"/>
@@ -10044,7 +10131,7 @@
       <w:r>
         <w:t xml:space="preserve">  ·  </w:t>
       </w:r>
-      <w:hyperlink r:id="rId73">
+      <w:hyperlink r:id="rId75">
         <w:r>
           <w:rPr>
             <w:color w:val="155D79"/>
@@ -10063,7 +10150,7 @@
       </w:r>
     </w:p>
     <w:p>
-      <w:hyperlink r:id="rId25">
+      <w:hyperlink r:id="rId24">
         <w:r>
           <w:rPr>
             <w:color w:val="155D79"/>
@@ -10075,7 +10162,7 @@
       <w:r>
         <w:t xml:space="preserve">  ·  </w:t>
       </w:r>
-      <w:hyperlink r:id="rId70">
+      <w:hyperlink r:id="rId72">
         <w:r>
           <w:rPr>
             <w:color w:val="155D79"/>
@@ -10087,7 +10174,7 @@
       <w:r>
         <w:t xml:space="preserve">  ·  </w:t>
       </w:r>
-      <w:hyperlink r:id="rId71">
+      <w:hyperlink r:id="rId73">
         <w:r>
           <w:rPr>
             <w:color w:val="155D79"/>
@@ -10099,7 +10186,7 @@
       <w:r>
         <w:t xml:space="preserve">  ·  </w:t>
       </w:r>
-      <w:hyperlink r:id="rId61">
+      <w:hyperlink r:id="rId63">
         <w:r>
           <w:rPr>
             <w:color w:val="155D79"/>
@@ -10111,7 +10198,7 @@
       <w:r>
         <w:t xml:space="preserve">  ·  </w:t>
       </w:r>
-      <w:hyperlink r:id="rId75">
+      <w:hyperlink r:id="rId77">
         <w:r>
           <w:rPr>
             <w:color w:val="155D79"/>
@@ -10127,7 +10214,6 @@
       </w:r>
     </w:p>
     <w:sectPr>
-      <w:footerReference w:type="default" r:id="rId9"/>
       <w:pgSz w:w="11906" w:h="16838"/>
       <w:pgMar w:top="1020" w:right="1020" w:bottom="964" w:left="1020" w:header="397" w:footer="454" w:gutter="0"/>
       <w:cols w:space="720"/>
@@ -10135,21 +10221,6 @@
     </w:sectPr>
   </w:body>
 </w:document>
-</file>
-
-<file path=word/footer1.xml><?xml version="1.0" encoding="utf-8"?>
-<w:ftr xmlns:m="http://schemas.openxmlformats.org/officeDocument/2006/math" xmlns:mc="http://schemas.openxmlformats.org/markup-compatibility/2006" xmlns:mo="http://schemas.microsoft.com/office/mac/office/2008/main" xmlns:mv="urn:schemas-microsoft-com:mac:vml" xmlns:o="urn:schemas-microsoft-com:office:office" xmlns:r="http://schemas.openxmlformats.org/officeDocument/2006/relationships" xmlns:v="urn:schemas-microsoft-com:vml" xmlns:w10="urn:schemas-microsoft-com:office:word" xmlns:w14="http://schemas.microsoft.com/office/word/2010/wordml" xmlns:w="http://schemas.openxmlformats.org/wordprocessingml/2006/main" xmlns:wne="http://schemas.microsoft.com/office/word/2006/wordml" xmlns:wp14="http://schemas.microsoft.com/office/word/2010/wordprocessingDrawing" xmlns:wp="http://schemas.openxmlformats.org/drawingml/2006/wordprocessingDrawing" xmlns:wpc="http://schemas.microsoft.com/office/word/2010/wordprocessingCanvas" xmlns:wpg="http://schemas.microsoft.com/office/word/2010/wordprocessingGroup" xmlns:wpi="http://schemas.microsoft.com/office/word/2010/wordprocessingInk" xmlns:wps="http://schemas.microsoft.com/office/word/2010/wordprocessingShape" mc:Ignorable="w14 wp14">
-  <w:p>
-    <w:pPr>
-      <w:pStyle w:val="Footer"/>
-      <w:jc w:val="right"/>
-    </w:pPr>
-    <w:r>
-      <w:t xml:space="preserve">Vietnam reisboekje  ·  4 oktober 2026  ·  </w:t>
-    </w:r>
-    <w:fldSimple w:instr="PAGE"/>
-  </w:p>
-</w:ftr>
 </file>
 
 <file path=word/numbering.xml><?xml version="1.0" encoding="utf-8"?>

</xml_diff>

<commit_message>
Make Vietnam guide warmer and more visual
</commit_message>
<xml_diff>
--- a/Vietnam_reisboekje_2026.docx
+++ b/Vietnam_reisboekje_2026.docx
@@ -19,18 +19,70 @@
       </w:r>
     </w:p>
     <w:p>
+      <w:pPr>
+        <w:jc w:val="center"/>
+      </w:pPr>
+      <w:r>
+        <w:drawing>
+          <wp:inline xmlns:a="http://schemas.openxmlformats.org/drawingml/2006/main" xmlns:pic="http://schemas.openxmlformats.org/drawingml/2006/picture">
+            <wp:extent cx="6083999" cy="2534477"/>
+            <wp:docPr id="1" name="Picture 1"/>
+            <wp:cNvGraphicFramePr>
+              <a:graphicFrameLocks noChangeAspect="1"/>
+            </wp:cNvGraphicFramePr>
+            <a:graphic>
+              <a:graphicData uri="http://schemas.openxmlformats.org/drawingml/2006/picture">
+                <pic:pic>
+                  <pic:nvPicPr>
+                    <pic:cNvPr id="0" name="vietnam-journey.jpg"/>
+                    <pic:cNvPicPr/>
+                  </pic:nvPicPr>
+                  <pic:blipFill>
+                    <a:blip r:embed="rId9"/>
+                    <a:stretch>
+                      <a:fillRect/>
+                    </a:stretch>
+                  </pic:blipFill>
+                  <pic:spPr>
+                    <a:xfrm>
+                      <a:off x="0" y="0"/>
+                      <a:ext cx="6083999" cy="2534477"/>
+                    </a:xfrm>
+                    <a:prstGeom prst="rect"/>
+                  </pic:spPr>
+                </pic:pic>
+              </a:graphicData>
+            </a:graphic>
+          </wp:inline>
+        </w:drawing>
+      </w:r>
+    </w:p>
+    <w:p>
+      <w:pPr>
+        <w:pStyle w:val="Source"/>
+      </w:pPr>
+      <w:r>
+        <w:t>Sfeerillustratie van jullie reis — geen foto van één specifieke plek.</w:t>
+      </w:r>
+    </w:p>
+    <w:p>
       <w:r>
         <w:t>Hanoi · Sa Pa · Ninh Bình · Ho Chi Minhstad · Cát Tiên</w:t>
       </w:r>
     </w:p>
     <w:p>
       <w:r>
-        <w:t>Twintig nachten. Eén bijzondere nachttrein. Bergen, water en levendige steden, met vier rustige nachten aan de rivier bij Cát Tiên voor jullie jungle-ervaring.</w:t>
+        <w:t>Straks lopen jullie door de avondstraten van Hanoi, worden jullie wakker tussen de bergen en eindigen jullie met vier rustige ochtenden aan de rivier bij Cát Tiên. En ergens daartussen: samen een nacht in de trein.</w:t>
       </w:r>
     </w:p>
     <w:p>
       <w:r>
-        <w:t>Dit is jullie vertrekpunt, geen afvinklijst. Data, prijzen en beschikbaarheid zijn voorlopig; de internationale vluchten en verblijven zijn nog niet geboekt.</w:t>
+        <w:t>Dit is de grote lijn voor jullie drie weken. De leuke details kiezen jullie onderweg; de vluchten en verblijven zijn nog niet geboekt.</w:t>
+      </w:r>
+    </w:p>
+    <w:p>
+      <w:r>
+        <w:br w:type="page"/>
       </w:r>
     </w:p>
     <w:p>
@@ -45,7 +97,7 @@
     </w:p>
     <w:p>
       <w:r>
-        <w:t>Vertrek uit Nederland rond 26 oktober 2026, aankomst in Hanoi rond 27 oktober en terugreis rond 16 november. Hanoi is het begin én einde. Phú Quốc, Hoi An en extra lange treinritten blijven buiten deze rustige route.</w:t>
+        <w:t>Rond 26 oktober vliegen jullie naar Hanoi. Daarna reizen jullie rustig via de bergen en Ninh Bình naar het zuiden, om rond 16 november weer vanuit Hanoi naar huis te gaan. Zo voelt drie weken als vakantie en niet als een race langs alle highlights.</w:t>
       </w:r>
     </w:p>
     <w:tbl>
@@ -743,22 +795,119 @@
     </w:p>
     <w:p>
       <w:r>
-        <w:t>Samen zijn dit precies 20 nachten. De laatste nacht in Hanoi geeft ruimte als een binnenlandse vlucht of transfer vertraging heeft.</w:t>
+        <w:t>Dit zijn 20 nachten samen. Die laatste nacht in Hanoi is fijn: nog één avond in de stad én wat speling voor de terugvlucht.</w:t>
       </w:r>
     </w:p>
     <w:p>
-      <w:bookmarkStart w:id="2" w:name="transport"/>
+      <w:bookmarkStart w:id="2" w:name="places"/>
+      <w:pPr>
+        <w:pStyle w:val="Heading1"/>
+      </w:pPr>
+      <w:r>
+        <w:t>Waar jullie naar uit kunnen kijken</w:t>
+      </w:r>
+      <w:bookmarkEnd w:id="2"/>
+    </w:p>
+    <w:p>
+      <w:pPr>
+        <w:pStyle w:val="Heading2"/>
+      </w:pPr>
+      <w:r>
+        <w:t>Hanoi</w:t>
+      </w:r>
+    </w:p>
+    <w:p>
+      <w:r>
+        <w:t>Begin gewoon met dwalen door de Old Quarter: kleine eetzaakjes, volle straten en steeds weer iets om naar te kijken. Loop langs het Hoàn Kiếm-meer en schuif ergens aan voor eten. Zin in een tempel? Ngọc Sơn of Trấn Quốc past makkelijk in een stadsdag. De weekendnachtmarkt is misschien nog een leuke bonus op jullie laatste avond.</w:t>
+      </w:r>
+    </w:p>
+    <w:p>
+      <w:pPr>
+        <w:pStyle w:val="Heading2"/>
+      </w:pPr>
+      <w:r>
+        <w:t>Sa Pa</w:t>
+      </w:r>
+    </w:p>
+    <w:p>
+      <w:r>
+        <w:t>Na de nachttrein: frisse berglucht en vier dagen zonder haast. Kies één mooie wandeling door de dorpen, drink ergens rustig koffie en kijk wat het weer doet. De kleurrijke zondagmarkt van Bắc Hà klinkt als iets voor jullie, maar ligt wel zo’n drie uur rijden verderop. Beslis daar of jullie er zin in hebben.</w:t>
+      </w:r>
+    </w:p>
+    <w:p>
+      <w:pPr>
+        <w:pStyle w:val="Heading2"/>
+      </w:pPr>
+      <w:r>
+        <w:t>Ninh Bình</w:t>
+      </w:r>
+    </w:p>
+    <w:p>
+      <w:r>
+        <w:t>Hier draait het om water tussen de kalksteenrotsen. Slaap bij Tam Cốc, liefst met uitzicht op het water, maak één boottocht en stap een ochtend op de fiets. Willen jullie nog meer groen, dan is Cúc Phương een fijne bosdag. Wilde apen spotten kan, maar laat het een verrassing blijven.</w:t>
+      </w:r>
+    </w:p>
+    <w:p>
+      <w:pPr>
+        <w:pStyle w:val="Heading2"/>
+      </w:pPr>
+      <w:r>
+        <w:t>Ho Chi Minhstad</w:t>
+      </w:r>
+    </w:p>
+    <w:p>
+      <w:r>
+        <w:t>Na het noorden is dit even een ander tempo: warme avonden, foodstalletjes en veel leven op straat. Jullie hebben twee nachten om rond te kijken en lekker te eten. Daarna wisselen jullie de stadsdrukte in voor de rivier; de extra nacht later is alleen een ontspannen tussenstop.</w:t>
+      </w:r>
+    </w:p>
+    <w:p>
+      <w:pPr>
+        <w:pStyle w:val="Heading2"/>
+      </w:pPr>
+      <w:r>
+        <w:t>Cát Tiên en Green Hope</w:t>
+      </w:r>
+    </w:p>
+    <w:p>
+      <w:r>
+        <w:t>Dit is het deel waar ik voor jullie het meest naar uitkijk: wakker worden aan de rivier, luisteren naar het bos en de dag rustig beginnen. Green Hope ligt aan de dorpskant van het park; vraag echt om een kamer met rivierzicht. Jullie kunnen zelf over toegestane paden wandelen en eventueel één vroege tocht met gids doen. Gibbons, apen of lori’s zien is mogelijk, maar het blijft wilde natuur. Voor eten is er de lodge en zijn er eenvoudige plekjes in het dorp.</w:t>
+      </w:r>
+    </w:p>
+    <w:p>
+      <w:pPr>
+        <w:pStyle w:val="Source"/>
+      </w:pPr>
+      <w:r>
+        <w:t xml:space="preserve">Bronnen en prijscontrole: </w:t>
+      </w:r>
+      <w:hyperlink r:id="rId10">
+        <w:r>
+          <w:rPr>
+            <w:color w:val="155D79"/>
+            <w:u w:val="single"/>
+          </w:rPr>
+          <w:t>Green Hope Lodge</w:t>
+        </w:r>
+      </w:hyperlink>
+    </w:p>
+    <w:p>
+      <w:r>
+        <w:br w:type="page"/>
+      </w:r>
+    </w:p>
+    <w:p>
+      <w:bookmarkStart w:id="3" w:name="transport"/>
       <w:pPr>
         <w:pStyle w:val="Heading1"/>
       </w:pPr>
       <w:r>
         <w:t>Van plek naar plek</w:t>
       </w:r>
-      <w:bookmarkEnd w:id="2"/>
+      <w:bookmarkEnd w:id="3"/>
     </w:p>
     <w:p>
       <w:r>
-        <w:t>De lange noord-zuidafstand doen jullie per vliegtuig. De nachttrein is de ene bewuste uitzondering: leuk om samen mee te maken, terwijl je slaapt. Onderstaande bedragen zijn ruwe richtprijzen voor twee, gecontroleerd op 4 oktober 2026, geen boekbare prijzen voor jullie data.</w:t>
+        <w:t>Eén lange treinreis voor de ervaring, daarna de echt lange afstand per vliegtuig: zo houden jullie tijd over voor de plekken zelf. Hieronder staat hoe lang een verplaatsing ongeveer duurt en wat je voor twee samen kunt reserveren. Het zijn richtprijzen van 4 oktober 2026; jullie exacte dagen kunnen anders uitvallen.</w:t>
       </w:r>
     </w:p>
     <w:tbl>
@@ -1305,7 +1454,7 @@
     </w:p>
     <w:p>
       <w:r>
-        <w:t>De VIP-coupé is een afsluitbare ruimte met bedden, airco en beddengoed. Toilet en wastafel zijn gedeeld. ‘VIP’ betekent per aanbieder iets anders: bevestig vóór betalen de wagon, twee slaapplaatsen, exclusief gebruik, bagage en of het bedrag per bed of voor de héle coupé is. De trein rijdt grotendeels in het donker; het gaat om de ervaring, niet om uitzicht.</w:t>
+        <w:t>De trein is jullie mini-avontuur: een afsluitbare coupé met bedden, airco en beddengoed. Toilet en wastafel deel je met de wagon. Vraag vóór boeken nog even of de prijs voor twee bedden én de hele coupé geldt; ‘VIP’ verschilt per aanbieder. Van het uitzicht zie je ’s nachts weinig, maar juist samen in zo’n cabine slapen is het leuke eraan.</w:t>
       </w:r>
     </w:p>
     <w:p>
@@ -1315,7 +1464,7 @@
       <w:r>
         <w:t xml:space="preserve">Bronnen en prijscontrole: </w:t>
       </w:r>
-      <w:hyperlink r:id="rId9">
+      <w:hyperlink r:id="rId11">
         <w:r>
           <w:rPr>
             <w:color w:val="155D79"/>
@@ -1327,7 +1476,7 @@
       <w:r>
         <w:t xml:space="preserve">  ·  </w:t>
       </w:r>
-      <w:hyperlink r:id="rId10">
+      <w:hyperlink r:id="rId12">
         <w:r>
           <w:rPr>
             <w:color w:val="155D79"/>
@@ -1339,7 +1488,7 @@
       <w:r>
         <w:t xml:space="preserve">  ·  </w:t>
       </w:r>
-      <w:hyperlink r:id="rId11">
+      <w:hyperlink r:id="rId13">
         <w:r>
           <w:rPr>
             <w:color w:val="155D79"/>
@@ -1351,7 +1500,7 @@
       <w:r>
         <w:t xml:space="preserve">  ·  </w:t>
       </w:r>
-      <w:hyperlink r:id="rId12">
+      <w:hyperlink r:id="rId14">
         <w:r>
           <w:rPr>
             <w:color w:val="155D79"/>
@@ -1363,105 +1512,13 @@
       <w:r>
         <w:t xml:space="preserve">  ·  </w:t>
       </w:r>
-      <w:hyperlink r:id="rId13">
+      <w:hyperlink r:id="rId15">
         <w:r>
           <w:rPr>
             <w:color w:val="155D79"/>
             <w:u w:val="single"/>
           </w:rPr>
           <w:t>Vietjet</w:t>
-        </w:r>
-      </w:hyperlink>
-    </w:p>
-    <w:p>
-      <w:bookmarkStart w:id="3" w:name="places"/>
-      <w:pPr>
-        <w:pStyle w:val="Heading1"/>
-      </w:pPr>
-      <w:r>
-        <w:t>Waarom juist deze plekken</w:t>
-      </w:r>
-      <w:bookmarkEnd w:id="3"/>
-    </w:p>
-    <w:p>
-      <w:pPr>
-        <w:pStyle w:val="Heading2"/>
-      </w:pPr>
-      <w:r>
-        <w:t>Hanoi</w:t>
-      </w:r>
-    </w:p>
-    <w:p>
-      <w:r>
-        <w:t>Een fijne landing met de drukte van de Old Quarter, lekker eten en wandelen rond Hoàn Kiếm. Als jullie zin hebben in een tempel, passen Ngọc Sơn en Trấn Quốc in een gewone stadsdag. De weekendnachtmarkt is een bonus op de laatste avond, afhankelijk van jullie aankomsttijd.</w:t>
-      </w:r>
-    </w:p>
-    <w:p>
-      <w:pPr>
-        <w:pStyle w:val="Heading2"/>
-      </w:pPr>
-      <w:r>
-        <w:t>Sa Pa</w:t>
-      </w:r>
-    </w:p>
-    <w:p>
-      <w:r>
-        <w:t>Vier nachten voor de bergen en dorpen, zonder iedere dag een excursie. Kies één mooie wandeling en laat ruimte voor cafés of een rustige dag. Bắc Hà op zondag 1 november kan bijzonder zijn voor de markt, maar vraagt ongeveer drie uur rijden per richting; besluit pas daar of die lange dag de moeite waard voelt.</w:t>
-      </w:r>
-    </w:p>
-    <w:p>
-      <w:pPr>
-        <w:pStyle w:val="Heading2"/>
-      </w:pPr>
-      <w:r>
-        <w:t>Ninh Bình</w:t>
-      </w:r>
-    </w:p>
-    <w:p>
-      <w:r>
-        <w:t>Slaap bij Tam Cốc, liefst met uitzicht op het water, zodat eten en kleine winkels dichtbij zijn. Doe één boottocht tussen de rotsen en een rustige fietstocht. Cúc Phương is de bosdag als jullie meer jungle willen; wilde apen zien blijft ook daar onzeker.</w:t>
-      </w:r>
-    </w:p>
-    <w:p>
-      <w:pPr>
-        <w:pStyle w:val="Heading2"/>
-      </w:pPr>
-      <w:r>
-        <w:t>Ho Chi Minhstad</w:t>
-      </w:r>
-    </w:p>
-    <w:p>
-      <w:r>
-        <w:t>Twee nachten voor stadse energie en eten op straat. Eén avond rond een foodmarkt is genoeg om die levendigheid mee te krijgen; daarna gaan jullie door naar het rustige Cát Tiên. De latere transitnacht houdt de terugreis ontspannen.</w:t>
-      </w:r>
-    </w:p>
-    <w:p>
-      <w:pPr>
-        <w:pStyle w:val="Heading2"/>
-      </w:pPr>
-      <w:r>
-        <w:t>Cát Tiên en Green Hope</w:t>
-      </w:r>
-    </w:p>
-    <w:p>
-      <w:r>
-        <w:t>Dit is jullie natuurhoogtepunt. Green Hope Lodge ligt aan de rivier aan de dorpskant van het park. Vraag expliciet om een kamer met rivierzicht. Plan vier nachten met tijd om zelf op toegestane paden te wandelen, vroeg naar gibbons te luisteren en eventueel één tocht met gids te doen. Apen of lori’s kunnen jullie zien, maar een ontmoeting zoals in Khao Sok is niet te garanderen. De lodge verzorgt maaltijden; in het dorp zijn eenvoudige eetplekken en kleine winkels, met minder keuze dan bij Khao Sok.</w:t>
-      </w:r>
-    </w:p>
-    <w:p>
-      <w:pPr>
-        <w:pStyle w:val="Source"/>
-      </w:pPr>
-      <w:r>
-        <w:t xml:space="preserve">Bronnen en prijscontrole: </w:t>
-      </w:r>
-      <w:hyperlink r:id="rId14">
-        <w:r>
-          <w:rPr>
-            <w:color w:val="155D79"/>
-            <w:u w:val="single"/>
-          </w:rPr>
-          <w:t>Green Hope Lodge</w:t>
         </w:r>
       </w:hyperlink>
     </w:p>
@@ -1477,7 +1534,7 @@
     </w:p>
     <w:p>
       <w:r>
-        <w:t>Een planningsband voor lokaal eten, eenvoudige maar fijne tweepersoonskamers, één privénachttrein, twee binnenlandse vluchten, bussen en een paar activiteiten. De intercontinentale vluchten komen hier nog bij.</w:t>
+        <w:t>Geen ingewikkelde spreadsheet: dit is ongeveer wat jullie in Vietnam kwijt zijn aan fijne, eenvoudige kamers, lokaal eten, vervoer en af en toe iets leuks. De vlucht vanuit Nederland komt er nog bij.</w:t>
       </w:r>
     </w:p>
     <w:tbl>
@@ -2024,12 +2081,7 @@
     </w:p>
     <w:p>
       <w:r>
-        <w:t>Dat is ongeveer €650–€1.186 per persoon voor Vietnam zelf. Mijn werkbedrag voor jullie is circa €925–€1.025 per persoon inclusief speling. De omrekening gebruikt €1 ≈ 29.256 ₫ op 4 oktober 2026; de werkelijke koers en kaartkosten kunnen afwijken.</w:t>
-      </w:r>
-    </w:p>
-    <w:p>
-      <w:r>
-        <w:br w:type="page"/>
+        <w:t>Omgerekend is dat ongeveer €650–€1.186 per persoon. Ik zou zelf rond €925–€1.025 per persoon opzijzetten, zodat jullie niet steeds hoeven rekenen. De eurobedragen zijn indicatief bij €1 ≈ 29.256 ₫ op 4 oktober 2026.</w:t>
       </w:r>
     </w:p>
     <w:p>
@@ -2044,7 +2096,7 @@
     </w:p>
     <w:p>
       <w:r>
-        <w:t>Boeken: vergelijk busritten via Vexere en kijk daarna bij de vervoerder. Controleer binnenlandse vluchten rechtstreeks bij Vietnam Airlines en Vietjet, inclusief jullie bagage. Voor de trein: check Vietnam Railways en bevestig bij een privérijtuigaanbieder schriftelijk de prijs voor twee en de hele coupé. Maak pas boekingen als de internationale vluchten vaststaan.</w:t>
+        <w:t>Boeken: vergelijk bussen via Vexere en vluchten rechtstreeks bij Vietnam Airlines en Vietjet, mét jullie bagage. Voor de trein: bevestig schriftelijk de prijs voor twee en de hele coupé. Check vlak voor vertrek ook paspoorten en het actuele reisadvies.</w:t>
       </w:r>
     </w:p>
     <w:tbl>
@@ -2450,7 +2502,7 @@
       <w:r>
         <w:t xml:space="preserve">Bronnen en prijscontrole: </w:t>
       </w:r>
-      <w:hyperlink r:id="rId15">
+      <w:hyperlink r:id="rId16">
         <w:r>
           <w:rPr>
             <w:color w:val="155D79"/>
@@ -2462,7 +2514,7 @@
       <w:r>
         <w:t xml:space="preserve">  ·  </w:t>
       </w:r>
-      <w:hyperlink r:id="rId16">
+      <w:hyperlink r:id="rId17">
         <w:r>
           <w:rPr>
             <w:color w:val="155D79"/>
@@ -2474,7 +2526,7 @@
       <w:r>
         <w:t xml:space="preserve">  ·  </w:t>
       </w:r>
-      <w:hyperlink r:id="rId17">
+      <w:hyperlink r:id="rId18">
         <w:r>
           <w:rPr>
             <w:color w:val="155D79"/>
@@ -2486,7 +2538,7 @@
       <w:r>
         <w:t xml:space="preserve">  ·  </w:t>
       </w:r>
-      <w:hyperlink r:id="rId18">
+      <w:hyperlink r:id="rId19">
         <w:r>
           <w:rPr>
             <w:color w:val="155D79"/>
@@ -2495,20 +2547,10 @@
           <w:t>Be vervoer</w:t>
         </w:r>
       </w:hyperlink>
-    </w:p>
-    <w:p>
       <w:r>
-        <w:t>Voor vertrek nog één check: paspoorten, het actuele Nederlandse reisadvies, vlucht- en bagageregels, de kamer met rivierzicht en de prijs van de treincoupé. Het weer kan in berg- en junglegebieden plannen veranderen; houd vrije dagen echt vrij.</w:t>
+        <w:t xml:space="preserve">  ·  </w:t>
       </w:r>
-    </w:p>
-    <w:p>
-      <w:pPr>
-        <w:pStyle w:val="Source"/>
-      </w:pPr>
-      <w:r>
-        <w:t xml:space="preserve">Bronnen en prijscontrole: </w:t>
-      </w:r>
-      <w:hyperlink r:id="rId19">
+      <w:hyperlink r:id="rId20">
         <w:r>
           <w:rPr>
             <w:color w:val="155D79"/>

</xml_diff>